<commit_message>
template 1 add fields
</commit_message>
<xml_diff>
--- a/converted_files/Письмо о представлении документации.docx
+++ b/converted_files/Письмо о представлении документации.docx
@@ -162,23 +162,7 @@
                 <w:b/>
                 <w:sz w:val="22"/>
               </w:rPr>
-              <w:t xml:space="preserve">(без приложения </w:t>
-            </w:r>
-            <w:proofErr w:type="spellStart"/>
-            <w:r>
-              <w:rPr>
-                <w:b/>
-                <w:sz w:val="22"/>
-              </w:rPr>
-              <w:t>неконфиденциально</w:t>
-            </w:r>
-            <w:proofErr w:type="spellEnd"/>
-            <w:r>
-              <w:rPr>
-                <w:b/>
-                <w:sz w:val="22"/>
-              </w:rPr>
-              <w:t>)</w:t>
+              <w:t>(без приложения неконфиденциально)</w:t>
             </w:r>
           </w:p>
           <w:p>
@@ -263,28 +247,6 @@
               </w:rPr>
               <w:t>Заместителю генерального директора</w:t>
             </w:r>
-            <w:proofErr w:type="spellStart"/>
-            <w:proofErr w:type="gramStart"/>
-            <w:r>
-              <w:rPr>
-                <w:b/>
-                <w:lang w:eastAsia="en-US"/>
-              </w:rPr>
-            </w:r>
-            <w:proofErr w:type="gramEnd"/>
-            <w:r>
-              <w:rPr>
-                <w:b/>
-                <w:lang w:eastAsia="en-US"/>
-              </w:rPr>
-            </w:r>
-            <w:proofErr w:type="spellEnd"/>
-            <w:r>
-              <w:rPr>
-                <w:b/>
-                <w:lang w:eastAsia="en-US"/>
-              </w:rPr>
-            </w:r>
           </w:p>
           <w:p>
             <w:pPr>
@@ -299,20 +261,6 @@
                 <w:lang w:eastAsia="en-US"/>
               </w:rPr>
               <w:t>ООО «Мяу Кусь»</w:t>
-            </w:r>
-            <w:proofErr w:type="spellStart"/>
-            <w:r>
-              <w:rPr>
-                <w:b/>
-                <w:lang w:eastAsia="en-US"/>
-              </w:rPr>
-            </w:r>
-            <w:proofErr w:type="spellEnd"/>
-            <w:r>
-              <w:rPr>
-                <w:b/>
-                <w:lang w:eastAsia="en-US"/>
-              </w:rPr>
             </w:r>
           </w:p>
           <w:p>
@@ -335,29 +283,7 @@
                 <w:b/>
                 <w:bCs/>
               </w:rPr>
-              <w:t>Иванов А.И.</w:t>
-            </w:r>
-            <w:proofErr w:type="spellStart"/>
-            <w:proofErr w:type="gramStart"/>
-            <w:r>
-              <w:rPr>
-                <w:b/>
-                <w:bCs/>
-              </w:rPr>
-            </w:r>
-            <w:proofErr w:type="gramEnd"/>
-            <w:r>
-              <w:rPr>
-                <w:b/>
-                <w:bCs/>
-              </w:rPr>
-            </w:r>
-            <w:proofErr w:type="spellEnd"/>
-            <w:r>
-              <w:rPr>
-                <w:b/>
-                <w:bCs/>
-              </w:rPr>
+              <w:t>Захаров А.Р.</w:t>
             </w:r>
           </w:p>
           <w:p/>
@@ -382,12 +308,16 @@
           <w:p>
             <w:pPr>
               <w:jc w:val="center"/>
+              <w:rPr>
+                <w:noProof/>
+              </w:rPr>
             </w:pPr>
             <w:r>
               <w:rPr>
-                <w:i/>
+                <w:noProof/>
+                <w:lang w:val="en-US"/>
               </w:rPr>
-              <w:t>11111</w:t>
+              <w:t>{data_field}</w:t>
             </w:r>
           </w:p>
         </w:tc>
@@ -433,12 +363,17 @@
           <w:p>
             <w:pPr>
               <w:jc w:val="center"/>
+              <w:rPr>
+                <w:noProof/>
+                <w:lang w:val="en-US"/>
+              </w:rPr>
             </w:pPr>
             <w:r>
               <w:rPr>
-                <w:i/>
+                <w:noProof/>
+                <w:lang w:val="en-US"/>
               </w:rPr>
-              <w:t>1111</w:t>
+              <w:t>{contract_field}</w:t>
             </w:r>
           </w:p>
         </w:tc>
@@ -665,32 +600,13 @@
         <w:rPr>
           <w:b/>
         </w:rPr>
-        <w:t>Уважаемый Андрей Игоревич!</w:t>
+        <w:t>Уважаемый Андрей Романович!</w:t>
       </w:r>
       <w:r>
         <w:rPr>
           <w:b/>
         </w:rPr>
       </w:r>
-      <w:r>
-        <w:rPr>
-          <w:b/>
-        </w:rPr>
-      </w:r>
-      <w:proofErr w:type="spellStart"/>
-      <w:proofErr w:type="gramStart"/>
-      <w:r>
-        <w:rPr>
-          <w:b/>
-        </w:rPr>
-      </w:r>
-      <w:proofErr w:type="gramEnd"/>
-      <w:r>
-        <w:rPr>
-          <w:b/>
-        </w:rPr>
-      </w:r>
-      <w:proofErr w:type="spellEnd"/>
       <w:r>
         <w:rPr>
           <w:b/>
@@ -715,7 +631,41 @@
         <w:rPr>
           <w:color w:val="auto"/>
         </w:rPr>
-        <w:t>Представляю Вам рабочую документацию по проекту «Дооснащение подсистем котов в домашних условиях ООО «Мур мяу», разработанную в рамках договора подряда №РД-5870 от , (далее – Рабочая документация) на электронном носителе согласно Приложению.</w:t>
+        <w:t>Представляю Вам {documentation_type} документацию по проекту «Дооснащение подсистем котов в домашних условиях ООО «Мур мяу», разработанную в рамках договора подряда №РД-5870 от 2025-05-16,  на электронном и бумажных носителях согласно Приложению.</w:t>
+      </w:r>
+      <w:r>
+        <w:rPr>
+          <w:color w:val="auto"/>
+        </w:rPr>
+      </w:r>
+      <w:r>
+        <w:rPr>
+          <w:color w:val="auto"/>
+          <w:lang w:val="en-US"/>
+        </w:rPr>
+      </w:r>
+      <w:r>
+        <w:rPr>
+          <w:color w:val="auto"/>
+          <w:lang w:val="en-US"/>
+        </w:rPr>
+      </w:r>
+      <w:r>
+        <w:rPr>
+          <w:color w:val="auto"/>
+          <w:lang w:val="en-US"/>
+        </w:rPr>
+      </w:r>
+      <w:r>
+        <w:rPr>
+          <w:color w:val="auto"/>
+        </w:rPr>
+      </w:r>
+      <w:r>
+        <w:rPr>
+          <w:color w:val="auto"/>
+          <w:lang w:val="en-US"/>
+        </w:rPr>
       </w:r>
       <w:r>
         <w:rPr>
@@ -757,7 +707,6 @@
           <w:color w:val="auto"/>
         </w:rPr>
       </w:r>
-      <w:proofErr w:type="spellStart"/>
       <w:r>
         <w:rPr>
           <w:color w:val="auto"/>
@@ -768,7 +717,6 @@
           <w:color w:val="auto"/>
         </w:rPr>
       </w:r>
-      <w:proofErr w:type="spellEnd"/>
       <w:r>
         <w:rPr>
           <w:color w:val="auto"/>
@@ -797,15 +745,15 @@
       <w:r/>
       <w:r/>
       <w:r/>
-      <w:proofErr w:type="spellStart"/>
-      <w:r/>
-      <w:proofErr w:type="spellEnd"/>
       <w:r/>
       <w:r/>
       <w:r/>
-      <w:proofErr w:type="spellStart"/>
       <w:r/>
-      <w:proofErr w:type="spellEnd"/>
+      <w:r/>
+      <w:r/>
+      <w:r/>
+      <w:r/>
+      <w:r/>
       <w:r/>
       <w:r/>
       <w:r/>
@@ -872,7 +820,7 @@
         <w:spacing w:before="0" w:after="0" w:line="360" w:lineRule="auto"/>
       </w:pPr>
       <w:r>
-        <w:t>Электронная версия рабочей документации по проекту «Дооснащение подсистем безопасности кошек в обычной жизни ООО «Мяу мышь» на электронном носителе CD-R, коммерческая тайна, уч. № КТ/Э 459 от 26.03.2025(календарь), экз. № 1/1(человек должен задать отдельно для дисков и бумажной документации) только в адрес. </w:t>
+        <w:t>Электронная версия {documentation_type} документации по проекту «Дооснащение подсистем безопасности кошек в обычной жизни ООО «Мяу мышь» на электронном носителе CD-R, коммерческая тайна, уч. № КТ/Э-{number_field} от {numbering_date}, экз. № {num_copies} только в адрес. </w:t>
       </w:r>
     </w:p>
     <w:p>
@@ -1109,33 +1057,7 @@
               </w:rPr>
               <w:t>Генеральный директор</w:t>
             </w:r>
-            <w:proofErr w:type="spellStart"/>
-            <w:proofErr w:type="gramStart"/>
-            <w:r>
-              <w:rPr>
-                <w:lang w:val="en-US"/>
-              </w:rPr>
-            </w:r>
-            <w:proofErr w:type="spellEnd"/>
-            <w:r>
-              <w:rPr>
-                <w:lang w:val="en-US"/>
-              </w:rPr>
-            </w:r>
             <w:r/>
-            <w:proofErr w:type="gramEnd"/>
-            <w:r>
-              <w:rPr>
-                <w:lang w:val="en-US"/>
-              </w:rPr>
-            </w:r>
-            <w:proofErr w:type="spellStart"/>
-            <w:r>
-              <w:rPr>
-                <w:lang w:val="en-US"/>
-              </w:rPr>
-            </w:r>
-            <w:proofErr w:type="spellEnd"/>
             <w:r>
               <w:rPr>
                 <w:lang w:val="en-US"/>
@@ -1174,13 +1096,6 @@
             <w:r>
               <w:t>П.Ф. Пропооп</w:t>
             </w:r>
-            <w:proofErr w:type="spellStart"/>
-            <w:proofErr w:type="gramStart"/>
-            <w:r/>
-            <w:proofErr w:type="gramEnd"/>
-            <w:r/>
-            <w:proofErr w:type="spellEnd"/>
-            <w:r/>
           </w:p>
         </w:tc>
       </w:tr>
@@ -1206,12 +1121,12 @@
       <w:pPr>
         <w:spacing w:line="14" w:lineRule="atLeast"/>
         <w:sectPr>
-          <w:footerReference w:type="even" r:id="rId9"/>
-          <w:footerReference w:type="default" r:id="rId10"/>
-          <w:footerReference w:type="first" r:id="rId11"/>
-          <w:headerReference w:type="default" r:id="rId15"/>
-          <w:headerReference w:type="even" r:id="rId16"/>
-          <w:headerReference w:type="first" r:id="rId17"/>
+          <w:headerReference w:type="even" r:id="rId9"/>
+          <w:headerReference w:type="default" r:id="rId10"/>
+          <w:footerReference w:type="even" r:id="rId11"/>
+          <w:footerReference w:type="default" r:id="rId12"/>
+          <w:headerReference w:type="first" r:id="rId13"/>
+          <w:footerReference w:type="first" r:id="rId14"/>
           <w:type w:val="continuous"/>
           <w:pgSz w:w="11906" w:h="16838"/>
           <w:pgMar w:top="1134" w:right="567" w:bottom="1134" w:left="1134" w:header="709" w:footer="709" w:gutter="0"/>
@@ -1223,7 +1138,7 @@
     </w:p>
     <w:p/>
     <w:sectPr>
-      <w:footerReference w:type="first" r:id="rId12"/>
+      <w:footerReference w:type="first" r:id="rId15"/>
       <w:pgSz w:w="11906" w:h="16838"/>
       <w:pgMar w:top="567" w:right="849" w:bottom="567" w:left="1134" w:header="709" w:footer="709" w:gutter="0"/>
       <w:cols w:space="708"/>
@@ -1318,7 +1233,6 @@
       <w:rPr>
         <w:sz w:val="16"/>
         <w:szCs w:val="16"/>
-        <w:lang w:val="en-US"/>
       </w:rPr>
     </w:pPr>
     <w:r>
@@ -1332,7 +1246,6 @@
       <w:rPr>
         <w:sz w:val="16"/>
         <w:szCs w:val="16"/>
-        <w:highlight w:val="red"/>
       </w:rPr>
       <w:t xml:space="preserve">. № </w:t>
     </w:r>
@@ -1340,7 +1253,6 @@
       <w:rPr>
         <w:sz w:val="16"/>
         <w:szCs w:val="16"/>
-        <w:highlight w:val="red"/>
         <w:lang w:val="en-US"/>
       </w:rPr>
       <w:t>{</w:t>
@@ -1349,16 +1261,22 @@
       <w:rPr>
         <w:sz w:val="16"/>
         <w:szCs w:val="16"/>
-        <w:highlight w:val="red"/>
         <w:lang w:val="en-US"/>
       </w:rPr>
-      <w:t>number</w:t>
+      <w:t>num</w:t>
     </w:r>
     <w:r>
       <w:rPr>
         <w:sz w:val="16"/>
         <w:szCs w:val="16"/>
-        <w:highlight w:val="red"/>
+        <w:lang w:val="en-US"/>
+      </w:rPr>
+      <w:t>ber</w:t>
+    </w:r>
+    <w:r>
+      <w:rPr>
+        <w:sz w:val="16"/>
+        <w:szCs w:val="16"/>
         <w:lang w:val="en-US"/>
       </w:rPr>
       <w:t xml:space="preserve"> </w:t>
@@ -1367,7 +1285,6 @@
       <w:rPr>
         <w:sz w:val="16"/>
         <w:szCs w:val="16"/>
-        <w:highlight w:val="red"/>
         <w:lang w:val="en-US"/>
       </w:rPr>
       <w:t>_field}</w:t>
@@ -1397,7 +1314,6 @@
       <w:rPr>
         <w:sz w:val="16"/>
         <w:szCs w:val="16"/>
-        <w:highlight w:val="red"/>
       </w:rPr>
       <w:t xml:space="preserve">№ </w:t>
     </w:r>
@@ -1405,7 +1321,6 @@
       <w:rPr>
         <w:sz w:val="16"/>
         <w:szCs w:val="16"/>
-        <w:highlight w:val="red"/>
       </w:rPr>
       <w:t>{</w:t>
     </w:r>
@@ -1413,16 +1328,22 @@
       <w:rPr>
         <w:sz w:val="16"/>
         <w:szCs w:val="16"/>
-        <w:highlight w:val="red"/>
         <w:lang w:val="en-US"/>
       </w:rPr>
-      <w:t>number</w:t>
+      <w:t>num</w:t>
     </w:r>
     <w:r>
       <w:rPr>
         <w:sz w:val="16"/>
         <w:szCs w:val="16"/>
-        <w:highlight w:val="red"/>
+        <w:lang w:val="en-US"/>
+      </w:rPr>
+      <w:t>ber</w:t>
+    </w:r>
+    <w:r>
+      <w:rPr>
+        <w:sz w:val="16"/>
+        <w:szCs w:val="16"/>
       </w:rPr>
       <w:t>_</w:t>
     </w:r>
@@ -1430,7 +1351,6 @@
       <w:rPr>
         <w:sz w:val="16"/>
         <w:szCs w:val="16"/>
-        <w:highlight w:val="red"/>
         <w:lang w:val="en-US"/>
       </w:rPr>
       <w:t>field</w:t>
@@ -1439,7 +1359,6 @@
       <w:rPr>
         <w:sz w:val="16"/>
         <w:szCs w:val="16"/>
-        <w:highlight w:val="red"/>
       </w:rPr>
       <w:t>}</w:t>
     </w:r>
@@ -1452,21 +1371,12 @@
         <w:szCs w:val="16"/>
       </w:rPr>
     </w:pPr>
-    <w:proofErr w:type="spellStart"/>
     <w:r>
       <w:rPr>
         <w:sz w:val="16"/>
         <w:szCs w:val="16"/>
       </w:rPr>
-      <w:t>Отп</w:t>
-    </w:r>
-    <w:proofErr w:type="spellEnd"/>
-    <w:r>
-      <w:rPr>
-        <w:sz w:val="16"/>
-        <w:szCs w:val="16"/>
-      </w:rPr>
-      <w:t xml:space="preserve">. 2 экз., на </w:t>
+      <w:t xml:space="preserve">Отп. 2 экз., на </w:t>
     </w:r>
     <w:r>
       <w:rPr>
@@ -1528,33 +1438,8 @@
         <w:sz w:val="16"/>
         <w:szCs w:val="16"/>
       </w:rPr>
-      <w:t xml:space="preserve">Исп. и </w:t>
+      <w:t>Исп. и отп. Гараева К.Д.</w:t>
     </w:r>
-    <w:proofErr w:type="spellStart"/>
-    <w:r>
-      <w:rPr>
-        <w:sz w:val="16"/>
-        <w:szCs w:val="16"/>
-      </w:rPr>
-      <w:t>отп</w:t>
-    </w:r>
-    <w:proofErr w:type="spellEnd"/>
-    <w:r>
-      <w:rPr>
-        <w:sz w:val="16"/>
-        <w:szCs w:val="16"/>
-      </w:rPr>
-      <w:t xml:space="preserve">. Гараева </w:t>
-    </w:r>
-    <w:proofErr w:type="gramStart"/>
-    <w:r>
-      <w:rPr>
-        <w:sz w:val="16"/>
-        <w:szCs w:val="16"/>
-      </w:rPr>
-      <w:t>К.Д.</w:t>
-    </w:r>
-    <w:proofErr w:type="gramEnd"/>
   </w:p>
   <w:p>
     <w:pPr>
@@ -1585,25 +1470,7 @@
         <w:szCs w:val="16"/>
         <w:lang w:val="en-US"/>
       </w:rPr>
-      <w:t>{</w:t>
-    </w:r>
-    <w:proofErr w:type="spellStart"/>
-    <w:r>
-      <w:rPr>
-        <w:sz w:val="16"/>
-        <w:szCs w:val="16"/>
-        <w:lang w:val="en-US"/>
-      </w:rPr>
-      <w:t>data_field</w:t>
-    </w:r>
-    <w:proofErr w:type="spellEnd"/>
-    <w:r>
-      <w:rPr>
-        <w:sz w:val="16"/>
-        <w:szCs w:val="16"/>
-        <w:lang w:val="en-US"/>
-      </w:rPr>
-      <w:t>}</w:t>
+      <w:t>{data_field}</w:t>
     </w:r>
   </w:p>
 </w:ftr>
@@ -1629,30 +1496,30 @@
 </file>
 
 <file path=word/header1.xml><?xml version="1.0" encoding="utf-8"?>
-<w:hdr xmlns:m="http://schemas.openxmlformats.org/officeDocument/2006/math" xmlns:mc="http://schemas.openxmlformats.org/markup-compatibility/2006" xmlns:mo="http://schemas.microsoft.com/office/mac/office/2008/main" xmlns:mv="urn:schemas-microsoft-com:mac:vml" xmlns:o="urn:schemas-microsoft-com:office:office" xmlns:r="http://schemas.openxmlformats.org/officeDocument/2006/relationships" xmlns:v="urn:schemas-microsoft-com:vml" xmlns:w10="urn:schemas-microsoft-com:office:word" xmlns:w14="http://schemas.microsoft.com/office/word/2010/wordml" xmlns:w="http://schemas.openxmlformats.org/wordprocessingml/2006/main" xmlns:wne="http://schemas.microsoft.com/office/word/2006/wordml" xmlns:wp14="http://schemas.microsoft.com/office/word/2010/wordprocessingDrawing" xmlns:wp="http://schemas.openxmlformats.org/drawingml/2006/wordprocessingDrawing" xmlns:wpc="http://schemas.microsoft.com/office/word/2010/wordprocessingCanvas" xmlns:wpg="http://schemas.microsoft.com/office/word/2010/wordprocessingGroup" xmlns:wpi="http://schemas.microsoft.com/office/word/2010/wordprocessingInk" xmlns:wps="http://schemas.microsoft.com/office/word/2010/wordprocessingShape" mc:Ignorable="w14 wp14">
+<w:hdr xmlns:wpc="http://schemas.microsoft.com/office/word/2010/wordprocessingCanvas" xmlns:cx="http://schemas.microsoft.com/office/drawing/2014/chartex" xmlns:cx1="http://schemas.microsoft.com/office/drawing/2015/9/8/chartex" xmlns:cx2="http://schemas.microsoft.com/office/drawing/2015/10/21/chartex" xmlns:cx3="http://schemas.microsoft.com/office/drawing/2016/5/9/chartex" xmlns:cx4="http://schemas.microsoft.com/office/drawing/2016/5/10/chartex" xmlns:cx5="http://schemas.microsoft.com/office/drawing/2016/5/11/chartex" xmlns:cx6="http://schemas.microsoft.com/office/drawing/2016/5/12/chartex" xmlns:cx7="http://schemas.microsoft.com/office/drawing/2016/5/13/chartex" xmlns:cx8="http://schemas.microsoft.com/office/drawing/2016/5/14/chartex" xmlns:mc="http://schemas.openxmlformats.org/markup-compatibility/2006" xmlns:aink="http://schemas.microsoft.com/office/drawing/2016/ink" xmlns:am3d="http://schemas.microsoft.com/office/drawing/2017/model3d" xmlns:o="urn:schemas-microsoft-com:office:office" xmlns:oel="http://schemas.microsoft.com/office/2019/extlst" xmlns:r="http://schemas.openxmlformats.org/officeDocument/2006/relationships" xmlns:m="http://schemas.openxmlformats.org/officeDocument/2006/math" xmlns:v="urn:schemas-microsoft-com:vml" xmlns:wp14="http://schemas.microsoft.com/office/word/2010/wordprocessingDrawing" xmlns:wp="http://schemas.openxmlformats.org/drawingml/2006/wordprocessingDrawing" xmlns:w10="urn:schemas-microsoft-com:office:word" xmlns:w="http://schemas.openxmlformats.org/wordprocessingml/2006/main" xmlns:w14="http://schemas.microsoft.com/office/word/2010/wordml" xmlns:w15="http://schemas.microsoft.com/office/word/2012/wordml" xmlns:w16cex="http://schemas.microsoft.com/office/word/2018/wordml/cex" xmlns:w16cid="http://schemas.microsoft.com/office/word/2016/wordml/cid" xmlns:w16="http://schemas.microsoft.com/office/word/2018/wordml" xmlns:w16du="http://schemas.microsoft.com/office/word/2023/wordml/word16du" xmlns:w16sdtdh="http://schemas.microsoft.com/office/word/2020/wordml/sdtdatahash" xmlns:w16sdtfl="http://schemas.microsoft.com/office/word/2024/wordml/sdtformatlock" xmlns:w16se="http://schemas.microsoft.com/office/word/2015/wordml/symex" xmlns:wpg="http://schemas.microsoft.com/office/word/2010/wordprocessingGroup" xmlns:wpi="http://schemas.microsoft.com/office/word/2010/wordprocessingInk" xmlns:wne="http://schemas.microsoft.com/office/word/2006/wordml" xmlns:wps="http://schemas.microsoft.com/office/word/2010/wordprocessingShape" mc:Ignorable="w14 w15 w16se w16cid w16 w16cex w16sdtdh w16sdtfl w16du wp14">
   <w:p>
     <w:pPr>
-      <w:pStyle w:val="Header"/>
+      <w:pStyle w:val="af1"/>
     </w:pPr>
   </w:p>
 </w:hdr>
 </file>
 
 <file path=word/header2.xml><?xml version="1.0" encoding="utf-8"?>
-<w:hdr xmlns:m="http://schemas.openxmlformats.org/officeDocument/2006/math" xmlns:mc="http://schemas.openxmlformats.org/markup-compatibility/2006" xmlns:mo="http://schemas.microsoft.com/office/mac/office/2008/main" xmlns:mv="urn:schemas-microsoft-com:mac:vml" xmlns:o="urn:schemas-microsoft-com:office:office" xmlns:r="http://schemas.openxmlformats.org/officeDocument/2006/relationships" xmlns:v="urn:schemas-microsoft-com:vml" xmlns:w10="urn:schemas-microsoft-com:office:word" xmlns:w14="http://schemas.microsoft.com/office/word/2010/wordml" xmlns:w="http://schemas.openxmlformats.org/wordprocessingml/2006/main" xmlns:wne="http://schemas.microsoft.com/office/word/2006/wordml" xmlns:wp14="http://schemas.microsoft.com/office/word/2010/wordprocessingDrawing" xmlns:wp="http://schemas.openxmlformats.org/drawingml/2006/wordprocessingDrawing" xmlns:wpc="http://schemas.microsoft.com/office/word/2010/wordprocessingCanvas" xmlns:wpg="http://schemas.microsoft.com/office/word/2010/wordprocessingGroup" xmlns:wpi="http://schemas.microsoft.com/office/word/2010/wordprocessingInk" xmlns:wps="http://schemas.microsoft.com/office/word/2010/wordprocessingShape" mc:Ignorable="w14 wp14">
+<w:hdr xmlns:wpc="http://schemas.microsoft.com/office/word/2010/wordprocessingCanvas" xmlns:cx="http://schemas.microsoft.com/office/drawing/2014/chartex" xmlns:cx1="http://schemas.microsoft.com/office/drawing/2015/9/8/chartex" xmlns:cx2="http://schemas.microsoft.com/office/drawing/2015/10/21/chartex" xmlns:cx3="http://schemas.microsoft.com/office/drawing/2016/5/9/chartex" xmlns:cx4="http://schemas.microsoft.com/office/drawing/2016/5/10/chartex" xmlns:cx5="http://schemas.microsoft.com/office/drawing/2016/5/11/chartex" xmlns:cx6="http://schemas.microsoft.com/office/drawing/2016/5/12/chartex" xmlns:cx7="http://schemas.microsoft.com/office/drawing/2016/5/13/chartex" xmlns:cx8="http://schemas.microsoft.com/office/drawing/2016/5/14/chartex" xmlns:mc="http://schemas.openxmlformats.org/markup-compatibility/2006" xmlns:aink="http://schemas.microsoft.com/office/drawing/2016/ink" xmlns:am3d="http://schemas.microsoft.com/office/drawing/2017/model3d" xmlns:o="urn:schemas-microsoft-com:office:office" xmlns:oel="http://schemas.microsoft.com/office/2019/extlst" xmlns:r="http://schemas.openxmlformats.org/officeDocument/2006/relationships" xmlns:m="http://schemas.openxmlformats.org/officeDocument/2006/math" xmlns:v="urn:schemas-microsoft-com:vml" xmlns:wp14="http://schemas.microsoft.com/office/word/2010/wordprocessingDrawing" xmlns:wp="http://schemas.openxmlformats.org/drawingml/2006/wordprocessingDrawing" xmlns:w10="urn:schemas-microsoft-com:office:word" xmlns:w="http://schemas.openxmlformats.org/wordprocessingml/2006/main" xmlns:w14="http://schemas.microsoft.com/office/word/2010/wordml" xmlns:w15="http://schemas.microsoft.com/office/word/2012/wordml" xmlns:w16cex="http://schemas.microsoft.com/office/word/2018/wordml/cex" xmlns:w16cid="http://schemas.microsoft.com/office/word/2016/wordml/cid" xmlns:w16="http://schemas.microsoft.com/office/word/2018/wordml" xmlns:w16du="http://schemas.microsoft.com/office/word/2023/wordml/word16du" xmlns:w16sdtdh="http://schemas.microsoft.com/office/word/2020/wordml/sdtdatahash" xmlns:w16sdtfl="http://schemas.microsoft.com/office/word/2024/wordml/sdtformatlock" xmlns:w16se="http://schemas.microsoft.com/office/word/2015/wordml/symex" xmlns:wpg="http://schemas.microsoft.com/office/word/2010/wordprocessingGroup" xmlns:wpi="http://schemas.microsoft.com/office/word/2010/wordprocessingInk" xmlns:wne="http://schemas.microsoft.com/office/word/2006/wordml" xmlns:wps="http://schemas.microsoft.com/office/word/2010/wordprocessingShape" mc:Ignorable="w14 w15 w16se w16cid w16 w16cex w16sdtdh w16sdtfl w16du wp14">
   <w:p>
     <w:pPr>
-      <w:pStyle w:val="Header"/>
+      <w:pStyle w:val="af1"/>
     </w:pPr>
   </w:p>
 </w:hdr>
 </file>
 
 <file path=word/header3.xml><?xml version="1.0" encoding="utf-8"?>
-<w:hdr xmlns:m="http://schemas.openxmlformats.org/officeDocument/2006/math" xmlns:mc="http://schemas.openxmlformats.org/markup-compatibility/2006" xmlns:mo="http://schemas.microsoft.com/office/mac/office/2008/main" xmlns:mv="urn:schemas-microsoft-com:mac:vml" xmlns:o="urn:schemas-microsoft-com:office:office" xmlns:r="http://schemas.openxmlformats.org/officeDocument/2006/relationships" xmlns:v="urn:schemas-microsoft-com:vml" xmlns:w10="urn:schemas-microsoft-com:office:word" xmlns:w14="http://schemas.microsoft.com/office/word/2010/wordml" xmlns:w="http://schemas.openxmlformats.org/wordprocessingml/2006/main" xmlns:wne="http://schemas.microsoft.com/office/word/2006/wordml" xmlns:wp14="http://schemas.microsoft.com/office/word/2010/wordprocessingDrawing" xmlns:wp="http://schemas.openxmlformats.org/drawingml/2006/wordprocessingDrawing" xmlns:wpc="http://schemas.microsoft.com/office/word/2010/wordprocessingCanvas" xmlns:wpg="http://schemas.microsoft.com/office/word/2010/wordprocessingGroup" xmlns:wpi="http://schemas.microsoft.com/office/word/2010/wordprocessingInk" xmlns:wps="http://schemas.microsoft.com/office/word/2010/wordprocessingShape" mc:Ignorable="w14 wp14">
+<w:hdr xmlns:wpc="http://schemas.microsoft.com/office/word/2010/wordprocessingCanvas" xmlns:cx="http://schemas.microsoft.com/office/drawing/2014/chartex" xmlns:cx1="http://schemas.microsoft.com/office/drawing/2015/9/8/chartex" xmlns:cx2="http://schemas.microsoft.com/office/drawing/2015/10/21/chartex" xmlns:cx3="http://schemas.microsoft.com/office/drawing/2016/5/9/chartex" xmlns:cx4="http://schemas.microsoft.com/office/drawing/2016/5/10/chartex" xmlns:cx5="http://schemas.microsoft.com/office/drawing/2016/5/11/chartex" xmlns:cx6="http://schemas.microsoft.com/office/drawing/2016/5/12/chartex" xmlns:cx7="http://schemas.microsoft.com/office/drawing/2016/5/13/chartex" xmlns:cx8="http://schemas.microsoft.com/office/drawing/2016/5/14/chartex" xmlns:mc="http://schemas.openxmlformats.org/markup-compatibility/2006" xmlns:aink="http://schemas.microsoft.com/office/drawing/2016/ink" xmlns:am3d="http://schemas.microsoft.com/office/drawing/2017/model3d" xmlns:o="urn:schemas-microsoft-com:office:office" xmlns:oel="http://schemas.microsoft.com/office/2019/extlst" xmlns:r="http://schemas.openxmlformats.org/officeDocument/2006/relationships" xmlns:m="http://schemas.openxmlformats.org/officeDocument/2006/math" xmlns:v="urn:schemas-microsoft-com:vml" xmlns:wp14="http://schemas.microsoft.com/office/word/2010/wordprocessingDrawing" xmlns:wp="http://schemas.openxmlformats.org/drawingml/2006/wordprocessingDrawing" xmlns:w10="urn:schemas-microsoft-com:office:word" xmlns:w="http://schemas.openxmlformats.org/wordprocessingml/2006/main" xmlns:w14="http://schemas.microsoft.com/office/word/2010/wordml" xmlns:w15="http://schemas.microsoft.com/office/word/2012/wordml" xmlns:w16cex="http://schemas.microsoft.com/office/word/2018/wordml/cex" xmlns:w16cid="http://schemas.microsoft.com/office/word/2016/wordml/cid" xmlns:w16="http://schemas.microsoft.com/office/word/2018/wordml" xmlns:w16du="http://schemas.microsoft.com/office/word/2023/wordml/word16du" xmlns:w16sdtdh="http://schemas.microsoft.com/office/word/2020/wordml/sdtdatahash" xmlns:w16sdtfl="http://schemas.microsoft.com/office/word/2024/wordml/sdtformatlock" xmlns:w16se="http://schemas.microsoft.com/office/word/2015/wordml/symex" xmlns:wpg="http://schemas.microsoft.com/office/word/2010/wordprocessingGroup" xmlns:wpi="http://schemas.microsoft.com/office/word/2010/wordprocessingInk" xmlns:wne="http://schemas.microsoft.com/office/word/2006/wordml" xmlns:wps="http://schemas.microsoft.com/office/word/2010/wordprocessingShape" mc:Ignorable="w14 w15 w16se w16cid w16 w16cex w16sdtdh w16sdtfl w16du wp14">
   <w:p>
     <w:pPr>
-      <w:pStyle w:val="Header"/>
+      <w:pStyle w:val="af1"/>
     </w:pPr>
   </w:p>
 </w:hdr>

</xml_diff>